<commit_message>
fix: update transport supplier selection process to reflect Viettel Post operations
</commit_message>
<xml_diff>
--- a/01.WORKING_SPACE/duy/25410194_Nguyen_Thanh_Duy_quan_ly_lua_chon_doi_tac_van_tai.docx
+++ b/01.WORKING_SPACE/duy/25410194_Nguyen_Thanh_Duy_quan_ly_lua_chon_doi_tac_van_tai.docx
@@ -28,7 +28,10 @@
         <w:jc w:val="both"/>
       </w:pPr>
       <w:r>
-        <w:t>Quy trình Quản lý và lựa chọn đối tác cung ứng phương tiện vận tải (Transport Supplier Selection and Management) hỗ trợ hoạt động khai thác logistics tại Viettel Logistics. Quy trình bắt đầu khi năng lực đội xe hiện có không đáp ứng nhu cầu và kết thúc khi đối tác được phê duyệt, ký hợp đồng, kích hoạt trên danh sách cung ứng hoặc khi hồ sơ được kết luận không phù hợp. Mục tiêu là mở rộng năng lực vận tải đồng thời kiểm soát yêu cầu kỹ thuật, an toàn, thương mại và pháp lý.</w:t>
+        <w:t xml:space="preserve">Quy trình Quản lý và lựa chọn đối tác cung ứng phương tiện vận tải (Transport Supplier Selection and Management) hỗ trợ hoạt động khai thác logistics tại Viettel Post. Quy trình tham chiếu hoạt động xã hội hóa vận tải do đơn vị thành viên Viettel Logistics công bố. Quy trình bắt đầu khi năng lực đội xe hiện có không đáp ứng nhu cầu và kết thúc khi đối tác được phê duyệt, ký hợp đồng, kích hoạt trên danh sách cung ứng hoặc khi hồ sơ được kết luận không phù hợp. Mục tiêu là mở rộng năng lực vận tải đồng thời </w:t>
+      </w:r>
+      <w:r>
+        <w:t>kiểm soát yêu cầu kỹ thuật, an toàn, thương mại và pháp lý.</w:t>
       </w:r>
     </w:p>
     <w:p>
@@ -94,7 +97,7 @@
         <w:jc w:val="both"/>
       </w:pPr>
       <w:r>
-        <w:t>Hồ sơ qua vòng sơ bộ được đánh giá chuyên sâu về năng lực cung ứng, kỹ thuật, an toàn, phạm vi tuyến và điều kiện thương mại. Viettel Logistics lựa chọn hình thức hợp tác, xây dựng cơ chế triển khai và thống nhất điều khoản. Hồ sơ không đạt hoặc không thống nhất được điều khoản sẽ không được lựa chọn.</w:t>
+        <w:t>Hồ sơ qua vòng sơ bộ được đánh giá chuyên sâu về năng lực cung ứng, kỹ thuật, an toàn, phạm vi tuyến và điều kiện thương mại. Viettel Post lựa chọn hình thức hợp tác, xây dựng cơ chế triển khai và thống nhất điều khoản. Hồ sơ không đạt hoặc không thống nhất được điều khoản sẽ không được lựa chọn.</w:t>
       </w:r>
     </w:p>
     <w:p>
@@ -152,7 +155,7 @@
           <w:noProof/>
         </w:rPr>
         <w:drawing>
-          <wp:inline distT="0" distB="0" distL="0" distR="0" wp14:anchorId="3E47CD0E" wp14:editId="63926375">
+          <wp:inline distT="0" distB="0" distL="0" distR="0" wp14:anchorId="18518C3F" wp14:editId="0B7E08C2">
             <wp:extent cx="9646920" cy="3730645"/>
             <wp:effectExtent l="0" t="0" r="0" b="0"/>
             <wp:docPr id="1" name="Picture 1"/>
@@ -408,10 +411,8 @@
     </w:p>
     <w:tbl>
       <w:tblPr>
-        <w:tblStyle w:val="TableNormal0"/>
         <w:tblW w:w="0" w:type="auto"/>
         <w:jc w:val="center"/>
-        <w:tblInd w:w="0" w:type="dxa"/>
         <w:tblBorders>
           <w:top w:val="single" w:sz="8" w:space="0" w:color="000000"/>
           <w:left w:val="single" w:sz="8" w:space="0" w:color="000000"/>
@@ -759,10 +760,8 @@
     </w:p>
     <w:tbl>
       <w:tblPr>
-        <w:tblStyle w:val="TableNormal0"/>
         <w:tblW w:w="0" w:type="auto"/>
         <w:jc w:val="center"/>
-        <w:tblInd w:w="0" w:type="dxa"/>
         <w:tblBorders>
           <w:top w:val="single" w:sz="8" w:space="0" w:color="000000"/>
           <w:left w:val="single" w:sz="8" w:space="0" w:color="000000"/>
@@ -1712,10 +1711,8 @@
     </w:p>
     <w:tbl>
       <w:tblPr>
-        <w:tblStyle w:val="TableNormal0"/>
         <w:tblW w:w="0" w:type="auto"/>
         <w:jc w:val="center"/>
-        <w:tblInd w:w="0" w:type="dxa"/>
         <w:tblBorders>
           <w:top w:val="single" w:sz="8" w:space="0" w:color="000000"/>
           <w:left w:val="single" w:sz="8" w:space="0" w:color="000000"/>
@@ -2046,10 +2043,8 @@
     </w:p>
     <w:tbl>
       <w:tblPr>
-        <w:tblStyle w:val="TableNormal0"/>
         <w:tblW w:w="0" w:type="auto"/>
         <w:jc w:val="center"/>
-        <w:tblInd w:w="0" w:type="dxa"/>
         <w:tblBorders>
           <w:top w:val="single" w:sz="8" w:space="0" w:color="000000"/>
           <w:left w:val="single" w:sz="8" w:space="0" w:color="000000"/>
@@ -2587,10 +2582,8 @@
     </w:p>
     <w:tbl>
       <w:tblPr>
-        <w:tblStyle w:val="TableNormal0"/>
         <w:tblW w:w="0" w:type="auto"/>
         <w:jc w:val="center"/>
-        <w:tblInd w:w="0" w:type="dxa"/>
         <w:tblBorders>
           <w:top w:val="single" w:sz="8" w:space="0" w:color="000000"/>
           <w:left w:val="single" w:sz="8" w:space="0" w:color="000000"/>
@@ -3302,10 +3295,8 @@
     </w:p>
     <w:tbl>
       <w:tblPr>
-        <w:tblStyle w:val="TableNormal0"/>
         <w:tblW w:w="0" w:type="auto"/>
         <w:jc w:val="center"/>
-        <w:tblInd w:w="0" w:type="dxa"/>
         <w:tblBorders>
           <w:top w:val="single" w:sz="8" w:space="0" w:color="000000"/>
           <w:left w:val="single" w:sz="8" w:space="0" w:color="000000"/>
@@ -3867,10 +3858,8 @@
     </w:p>
     <w:tbl>
       <w:tblPr>
-        <w:tblStyle w:val="TableNormal0"/>
         <w:tblW w:w="0" w:type="auto"/>
         <w:jc w:val="center"/>
-        <w:tblInd w:w="0" w:type="dxa"/>
         <w:tblBorders>
           <w:top w:val="single" w:sz="8" w:space="0" w:color="000000"/>
           <w:left w:val="single" w:sz="8" w:space="0" w:color="000000"/>
@@ -5460,7 +5449,6 @@
     </w:pPr>
     <w:rPr>
       <w:color w:val="666666"/>
-      <w:sz w:val="22"/>
     </w:rPr>
   </w:style>
   <w:style w:type="paragraph" w:styleId="Heading6">
@@ -5481,7 +5469,6 @@
       <w:i/>
       <w:iCs/>
       <w:color w:val="666666"/>
-      <w:sz w:val="22"/>
     </w:rPr>
   </w:style>
   <w:style w:type="character" w:default="1" w:styleId="DefaultParagraphFont">
@@ -5550,7 +5537,6 @@
       <w:spacing w:after="320"/>
     </w:pPr>
     <w:rPr>
-      <w:rFonts w:ascii="Arial" w:eastAsia="Arial" w:hAnsi="Arial"/>
       <w:color w:val="666666"/>
       <w:sz w:val="30"/>
       <w:szCs w:val="30"/>
@@ -5626,7 +5612,7 @@
     <w:link w:val="HeaderChar"/>
     <w:uiPriority w:val="99"/>
     <w:unhideWhenUsed/>
-    <w:rsid w:val="005B11BC"/>
+    <w:rsid w:val="009D3041"/>
     <w:pPr>
       <w:tabs>
         <w:tab w:val="center" w:pos="4680"/>
@@ -5640,7 +5626,7 @@
     <w:basedOn w:val="DefaultParagraphFont"/>
     <w:link w:val="Header"/>
     <w:uiPriority w:val="99"/>
-    <w:rsid w:val="005B11BC"/>
+    <w:rsid w:val="009D3041"/>
     <w:rPr>
       <w:rFonts w:ascii="Times New Roman" w:eastAsia="Times New Roman" w:hAnsi="Times New Roman"/>
       <w:color w:val="000000"/>
@@ -5653,7 +5639,7 @@
     <w:link w:val="FooterChar"/>
     <w:uiPriority w:val="99"/>
     <w:unhideWhenUsed/>
-    <w:rsid w:val="005B11BC"/>
+    <w:rsid w:val="009D3041"/>
     <w:pPr>
       <w:tabs>
         <w:tab w:val="center" w:pos="4680"/>
@@ -5667,7 +5653,7 @@
     <w:basedOn w:val="DefaultParagraphFont"/>
     <w:link w:val="Footer"/>
     <w:uiPriority w:val="99"/>
-    <w:rsid w:val="005B11BC"/>
+    <w:rsid w:val="009D3041"/>
     <w:rPr>
       <w:rFonts w:ascii="Times New Roman" w:eastAsia="Times New Roman" w:hAnsi="Times New Roman"/>
       <w:color w:val="000000"/>

</xml_diff>